<commit_message>
Update portfolio CV and ReelScholar outcome
</commit_message>
<xml_diff>
--- a/Takudzwanashe_Musere_CV.docx
+++ b/Takudzwanashe_Musere_CV.docx
@@ -30,7 +30,7 @@
           <w:sz w:val="20"/>
           <w:szCs w:val="20"/>
         </w:rPr>
-        <w:t>IT Support   •   Systems Administration   •   Software Development</w:t>
+        <w:t>Full-Stack Software Development   •   IT Support   •   Systems Administration</w:t>
       </w:r>
     </w:p>
     <w:p>
@@ -38,12 +38,21 @@
         <w:spacing w:after="20"/>
         <w:jc w:val="center"/>
       </w:pPr>
+      <w:proofErr w:type="spellStart"/>
       <w:r>
         <w:rPr>
           <w:sz w:val="19"/>
           <w:szCs w:val="19"/>
         </w:rPr>
-        <w:t>Budiriro 1, Harare, Zimbabwe   |   +263 77 564 9488   |   takudzwamusere@gmail.com</w:t>
+        <w:t>Budiriro</w:t>
+      </w:r>
+      <w:proofErr w:type="spellEnd"/>
+      <w:r>
+        <w:rPr>
+          <w:sz w:val="19"/>
+          <w:szCs w:val="19"/>
+        </w:rPr>
+        <w:t xml:space="preserve"> 1, Harare, Zimbabwe   |   +263 77 564 9488   |   takudzwamusere@gmail.com</w:t>
       </w:r>
     </w:p>
     <w:p>
@@ -58,26 +67,18 @@
             <w:sz w:val="19"/>
             <w:szCs w:val="19"/>
           </w:rPr>
-          <w:t>linkedin.com/in/takudzwa-musere</w:t>
+          <w:t>linkedin.com/in/</w:t>
         </w:r>
-      </w:hyperlink>
-      <w:r>
-        <w:rPr>
-          <w:color w:val="444444"/>
-          <w:sz w:val="19"/>
-          <w:szCs w:val="19"/>
-        </w:rPr>
-        <w:t xml:space="preserve">   |   </w:t>
-      </w:r>
-      <w:hyperlink r:id="rId6" w:history="1">
+        <w:proofErr w:type="spellStart"/>
         <w:r>
           <w:rPr>
             <w:color w:val="1F3A5F"/>
             <w:sz w:val="19"/>
             <w:szCs w:val="19"/>
           </w:rPr>
-          <w:t>github.com/takudzwanashemusere</w:t>
+          <w:t>takudzwa-musere</w:t>
         </w:r>
+        <w:proofErr w:type="spellEnd"/>
       </w:hyperlink>
       <w:r>
         <w:rPr>
@@ -85,9 +86,36 @@
           <w:sz w:val="19"/>
           <w:szCs w:val="19"/>
         </w:rPr>
-        <w:t xml:space="preserve">   |   </w:t>
-      </w:r>
-      <w:hyperlink r:id="rId7" w:history="1">
+        <w:t xml:space="preserve">   | </w:t>
+      </w:r>
+      <w:r>
+        <w:rPr>
+          <w:color w:val="444444"/>
+          <w:sz w:val="19"/>
+          <w:szCs w:val="19"/>
+        </w:rPr>
+        <w:t>github.com/</w:t>
+      </w:r>
+      <w:proofErr w:type="spellStart"/>
+      <w:r>
+        <w:rPr>
+          <w:color w:val="444444"/>
+          <w:sz w:val="19"/>
+          <w:szCs w:val="19"/>
+        </w:rPr>
+        <w:t>dcasiriyoungfly</w:t>
+      </w:r>
+      <w:proofErr w:type="spellEnd"/>
+      <w:r>
+        <w:rPr>
+          <w:color w:val="444444"/>
+          <w:sz w:val="19"/>
+          <w:szCs w:val="19"/>
+        </w:rPr>
+        <w:t xml:space="preserve">    |   </w:t>
+      </w:r>
+      <w:hyperlink r:id="rId6" w:history="1">
+        <w:proofErr w:type="spellStart"/>
         <w:r>
           <w:rPr>
             <w:b/>
@@ -98,6 +126,7 @@
           </w:rPr>
           <w:t>takudzwamusere.vercel.app</w:t>
         </w:r>
+        <w:proofErr w:type="spellEnd"/>
       </w:hyperlink>
     </w:p>
     <w:p>
@@ -118,13 +147,71 @@
         </w:rPr>
         <w:t>PROFILE</w:t>
       </w:r>
+      <w:bookmarkStart w:id="0" w:name="_GoBack"/>
+      <w:bookmarkEnd w:id="0"/>
     </w:p>
     <w:p>
       <w:pPr>
         <w:spacing w:after="40" w:line="264" w:lineRule="auto"/>
       </w:pPr>
       <w:r>
-        <w:t>Information Technology graduate (BSc Honours, Chinhoyi University of Technology) with practical experience in IT support, hardware troubleshooting, network configuration and system maintenance gained through an IT internship in a service-critical healthcare environment. Comfortable providing first-line helpdesk support with minimal disruption to operations and complemented by full-stack software development across web, mobile and cross-platform desktop applications — using React and Electron with SQLite, alongside Flutter, Laravel, Python and PHP. A quick learner with a professional, patient approach to training and supporting end users.</w:t>
+        <w:t xml:space="preserve">IT and software development professional (BSc </w:t>
+      </w:r>
+      <w:proofErr w:type="spellStart"/>
+      <w:r>
+        <w:t>Honours</w:t>
+      </w:r>
+      <w:proofErr w:type="spellEnd"/>
+      <w:r>
+        <w:t xml:space="preserve">, Information Technology, </w:t>
+      </w:r>
+      <w:proofErr w:type="spellStart"/>
+      <w:r>
+        <w:t>Chinhoyi</w:t>
+      </w:r>
+      <w:proofErr w:type="spellEnd"/>
+      <w:r>
+        <w:t xml:space="preserve"> University of Technology) who builds and ships full-stack systems, not just supports them. Designed and deployed </w:t>
+      </w:r>
+      <w:proofErr w:type="spellStart"/>
+      <w:r>
+        <w:t>ReelScholar</w:t>
+      </w:r>
+      <w:proofErr w:type="spellEnd"/>
+      <w:r>
+        <w:t xml:space="preserve">, an AI-powered mobile learning platform with a custom content-moderation model and recommendation engine validated at an 84.1/100 System Usability Scale score across real user testing. Delivered two further production systems — a Windows-packaged Offline School Management Application and a role-based school portal web app — alongside hands-on IT support experience in a service-critical healthcare environment, including network configuration, </w:t>
+      </w:r>
+      <w:proofErr w:type="spellStart"/>
+      <w:r>
+        <w:t>fibre</w:t>
+      </w:r>
+      <w:proofErr w:type="spellEnd"/>
+      <w:r>
+        <w:t>/</w:t>
+      </w:r>
+      <w:proofErr w:type="spellStart"/>
+      <w:r>
+        <w:t>Starlink</w:t>
+      </w:r>
+      <w:proofErr w:type="spellEnd"/>
+      <w:r>
+        <w:t xml:space="preserve"> deployment and DHIS2 administration. Works confidently across React, Flutter, </w:t>
+      </w:r>
+      <w:proofErr w:type="spellStart"/>
+      <w:r>
+        <w:t>Laravel</w:t>
+      </w:r>
+      <w:proofErr w:type="spellEnd"/>
+      <w:r>
+        <w:t xml:space="preserve">, </w:t>
+      </w:r>
+      <w:proofErr w:type="spellStart"/>
+      <w:r>
+        <w:t>FastAPI</w:t>
+      </w:r>
+      <w:proofErr w:type="spellEnd"/>
+      <w:r>
+        <w:t>, Python and PHP.</w:t>
       </w:r>
     </w:p>
     <w:p>
@@ -143,7 +230,7 @@
           <w:sz w:val="24"/>
           <w:szCs w:val="24"/>
         </w:rPr>
-        <w:t>EDUCATION</w:t>
+        <w:t>KEY TECHNICAL PROJECTS</w:t>
       </w:r>
     </w:p>
     <w:p>
@@ -151,25 +238,87 @@
         <w:tabs>
           <w:tab w:val="right" w:pos="10080"/>
         </w:tabs>
-        <w:spacing w:after="50" w:line="252" w:lineRule="auto"/>
-      </w:pPr>
-      <w:r>
-        <w:rPr>
-          <w:b/>
-          <w:bCs/>
-        </w:rPr>
-        <w:t>BSc (Honours) Information Technology  |  Chinhoyi University of Technology</w:t>
-      </w:r>
+      </w:pPr>
+      <w:hyperlink r:id="rId7" w:history="1">
+        <w:proofErr w:type="spellStart"/>
+        <w:r>
+          <w:rPr>
+            <w:b/>
+            <w:bCs/>
+            <w:color w:val="1F3A5F"/>
+            <w:u w:val="single"/>
+          </w:rPr>
+          <w:t>ReelScholar</w:t>
+        </w:r>
+        <w:proofErr w:type="spellEnd"/>
+      </w:hyperlink>
       <w:r>
         <w:rPr>
           <w:i/>
           <w:iCs/>
           <w:color w:val="444444"/>
-          <w:sz w:val="20"/>
-          <w:szCs w:val="20"/>
-        </w:rPr>
-        <w:tab/>
-        <w:t>2022 – 2025</w:t>
+        </w:rPr>
+        <w:t xml:space="preserve">   |   Flutter, </w:t>
+      </w:r>
+      <w:proofErr w:type="spellStart"/>
+      <w:r>
+        <w:rPr>
+          <w:i/>
+          <w:iCs/>
+          <w:color w:val="444444"/>
+        </w:rPr>
+        <w:t>Laravel</w:t>
+      </w:r>
+      <w:proofErr w:type="spellEnd"/>
+      <w:r>
+        <w:rPr>
+          <w:i/>
+          <w:iCs/>
+          <w:color w:val="444444"/>
+        </w:rPr>
+        <w:t>, Python/</w:t>
+      </w:r>
+      <w:proofErr w:type="spellStart"/>
+      <w:r>
+        <w:rPr>
+          <w:i/>
+          <w:iCs/>
+          <w:color w:val="444444"/>
+        </w:rPr>
+        <w:t>TensorFlow</w:t>
+      </w:r>
+      <w:proofErr w:type="spellEnd"/>
+      <w:r>
+        <w:rPr>
+          <w:i/>
+          <w:iCs/>
+          <w:color w:val="444444"/>
+        </w:rPr>
+        <w:t>, SQLite/MySQL</w:t>
+      </w:r>
+    </w:p>
+    <w:p>
+      <w:pPr>
+        <w:spacing w:after="40" w:line="252" w:lineRule="auto"/>
+      </w:pPr>
+      <w:r>
+        <w:t xml:space="preserve">Full-stack AI micro-learning mobile platform built as a capstone project for university students. Features user authentication, real-time messaging, AI-powered content moderation, gamification and a recommendation engine. </w:t>
+      </w:r>
+      <w:proofErr w:type="spellStart"/>
+      <w:r>
+        <w:t>Laravel</w:t>
+      </w:r>
+      <w:proofErr w:type="spellEnd"/>
+      <w:r>
+        <w:t xml:space="preserve"> REST API hosted on </w:t>
+      </w:r>
+      <w:proofErr w:type="spellStart"/>
+      <w:r>
+        <w:t>Laravel</w:t>
+      </w:r>
+      <w:proofErr w:type="spellEnd"/>
+      <w:r>
+        <w:t xml:space="preserve"> Cloud, with the Python MobileNetV2 moderation model deployed on Railway. Achieved an 84.1/100 System Usability Scale score from 25 test users.</w:t>
       </w:r>
     </w:p>
     <w:p>
@@ -177,21 +326,50 @@
         <w:tabs>
           <w:tab w:val="right" w:pos="10080"/>
         </w:tabs>
-        <w:spacing w:after="50" w:line="252" w:lineRule="auto"/>
-      </w:pPr>
-      <w:r>
-        <w:t>Advanced Level – 3 passes</w:t>
-      </w:r>
+        <w:spacing w:before="140"/>
+      </w:pPr>
+      <w:hyperlink r:id="rId8" w:history="1">
+        <w:r>
+          <w:rPr>
+            <w:b/>
+            <w:bCs/>
+            <w:color w:val="1F3A5F"/>
+            <w:u w:val="single"/>
+          </w:rPr>
+          <w:t>Divine School Management System</w:t>
+        </w:r>
+      </w:hyperlink>
       <w:r>
         <w:rPr>
           <w:i/>
           <w:iCs/>
           <w:color w:val="444444"/>
-          <w:sz w:val="20"/>
-          <w:szCs w:val="20"/>
-        </w:rPr>
-        <w:tab/>
-        <w:t>2020 – 2021</w:t>
+        </w:rPr>
+        <w:t xml:space="preserve">   |   Electron, React, Node.js &amp; SQLite</w:t>
+      </w:r>
+    </w:p>
+    <w:p>
+      <w:pPr>
+        <w:spacing w:after="40" w:line="252" w:lineRule="auto"/>
+      </w:pPr>
+      <w:r>
+        <w:t xml:space="preserve">Offline-first desktop application delivered for a primary school, built with Electron, React and Node.js over a local SQLite database. Role-based modules (Administrator, Bursar, </w:t>
+      </w:r>
+      <w:proofErr w:type="gramStart"/>
+      <w:r>
+        <w:t>Teacher</w:t>
+      </w:r>
+      <w:proofErr w:type="gramEnd"/>
+      <w:r>
+        <w:t xml:space="preserve">) cover student registration, guardian records, fee payments with printable PDF receipts, attendance and academic reporting, plus one-click backup and restore. Secured with </w:t>
+      </w:r>
+      <w:proofErr w:type="spellStart"/>
+      <w:r>
+        <w:t>bcrypt</w:t>
+      </w:r>
+      <w:proofErr w:type="spellEnd"/>
+      <w:r>
+        <w:t xml:space="preserve"> password hashing, role-based permissions, audit logging and Electron context isolation; packaged as a Windows installer for fully offline use in low-connectivity environments.</w:t>
       </w:r>
     </w:p>
     <w:p>
@@ -199,21 +377,60 @@
         <w:tabs>
           <w:tab w:val="right" w:pos="10080"/>
         </w:tabs>
-        <w:spacing w:after="50" w:line="252" w:lineRule="auto"/>
-      </w:pPr>
-      <w:r>
-        <w:t>Ordinary Level – 11 passes (incl. English &amp; Mathematics)</w:t>
-      </w:r>
+        <w:spacing w:before="140"/>
+      </w:pPr>
+      <w:hyperlink r:id="rId9" w:history="1">
+        <w:r>
+          <w:rPr>
+            <w:b/>
+            <w:bCs/>
+            <w:color w:val="1F3A5F"/>
+            <w:u w:val="single"/>
+          </w:rPr>
+          <w:t>School Portal System</w:t>
+        </w:r>
+      </w:hyperlink>
       <w:r>
         <w:rPr>
           <w:i/>
           <w:iCs/>
           <w:color w:val="444444"/>
-          <w:sz w:val="20"/>
-          <w:szCs w:val="20"/>
-        </w:rPr>
-        <w:tab/>
-        <w:t>2016 – 2019</w:t>
+        </w:rPr>
+        <w:t xml:space="preserve">   |   Flutter, </w:t>
+      </w:r>
+      <w:proofErr w:type="spellStart"/>
+      <w:r>
+        <w:rPr>
+          <w:i/>
+          <w:iCs/>
+          <w:color w:val="444444"/>
+        </w:rPr>
+        <w:t>FastAPI</w:t>
+      </w:r>
+      <w:proofErr w:type="spellEnd"/>
+      <w:r>
+        <w:rPr>
+          <w:i/>
+          <w:iCs/>
+          <w:color w:val="444444"/>
+        </w:rPr>
+        <w:t>, &amp; MongoDB</w:t>
+      </w:r>
+    </w:p>
+    <w:p>
+      <w:pPr>
+        <w:spacing w:after="40" w:line="252" w:lineRule="auto"/>
+      </w:pPr>
+      <w:r>
+        <w:t xml:space="preserve">Role-based school management web application with three distinct user roles (Administrator, Staff, </w:t>
+      </w:r>
+      <w:proofErr w:type="gramStart"/>
+      <w:r>
+        <w:t>Student</w:t>
+      </w:r>
+      <w:proofErr w:type="gramEnd"/>
+      <w:r>
+        <w:t>), enforcing data segregation and appropriate access control. Manages student records, academic results and operational reporting.</w:t>
       </w:r>
     </w:p>
     <w:p>
@@ -247,10 +464,7 @@
         <w:t xml:space="preserve">Languages: </w:t>
       </w:r>
       <w:r>
-        <w:t>Python, PHP, JavaScript</w:t>
-      </w:r>
-      <w:r>
-        <w:t>, Dart, HTML/CSS</w:t>
+        <w:t>Python, PHP, JavaScript, Dart, HTML/CSS</w:t>
       </w:r>
     </w:p>
     <w:p>
@@ -265,7 +479,23 @@
         <w:t xml:space="preserve">Frameworks &amp; Technologies: </w:t>
       </w:r>
       <w:r>
-        <w:t>React, Electron, Flutter, Laravel, FastAPI, Node.js</w:t>
+        <w:t xml:space="preserve">React, Electron, Flutter, </w:t>
+      </w:r>
+      <w:proofErr w:type="spellStart"/>
+      <w:r>
+        <w:t>Laravel</w:t>
+      </w:r>
+      <w:proofErr w:type="spellEnd"/>
+      <w:r>
+        <w:t xml:space="preserve">, </w:t>
+      </w:r>
+      <w:proofErr w:type="spellStart"/>
+      <w:r>
+        <w:t>FastAPI</w:t>
+      </w:r>
+      <w:proofErr w:type="spellEnd"/>
+      <w:r>
+        <w:t>, Node.js</w:t>
       </w:r>
     </w:p>
     <w:p>
@@ -295,7 +525,23 @@
         <w:t xml:space="preserve">Hardware &amp; Networking: </w:t>
       </w:r>
       <w:r>
-        <w:t>Hardware troubleshooting &amp; maintenance; network setup (routers, switches, fibre optic/Starlink); firmware &amp; security patching; endpoint deployment and support</w:t>
+        <w:t xml:space="preserve">Hardware troubleshooting &amp; maintenance; network setup (routers, switches, </w:t>
+      </w:r>
+      <w:proofErr w:type="spellStart"/>
+      <w:r>
+        <w:t>fibre</w:t>
+      </w:r>
+      <w:proofErr w:type="spellEnd"/>
+      <w:r>
+        <w:t xml:space="preserve"> optic/</w:t>
+      </w:r>
+      <w:proofErr w:type="spellStart"/>
+      <w:r>
+        <w:t>Starlink</w:t>
+      </w:r>
+      <w:proofErr w:type="spellEnd"/>
+      <w:r>
+        <w:t>); firmware &amp; security patching; endpoint deployment and support</w:t>
       </w:r>
     </w:p>
     <w:p>
@@ -324,31 +570,44 @@
         </w:rPr>
         <w:t xml:space="preserve">Tools &amp; Other: </w:t>
       </w:r>
-      <w:r>
-        <w:t>Git/GitHub, DHIS2, helpdesk &amp; remote support, user training &amp; documentation, IT inventory management</w:t>
+      <w:proofErr w:type="spellStart"/>
+      <w:r>
+        <w:t>Git</w:t>
+      </w:r>
+      <w:proofErr w:type="spellEnd"/>
+      <w:r>
+        <w:t>/GitHub, DHIS2, helpdesk &amp; remote support, user training &amp; documentation, IT inventory management</w:t>
       </w:r>
     </w:p>
     <w:p>
       <w:pPr>
         <w:spacing w:after="60" w:line="252" w:lineRule="auto"/>
-        <w:rPr>
-          <w:b/>
-        </w:rPr>
-      </w:pPr>
-      <w:r>
-        <w:rPr>
-          <w:b/>
-        </w:rPr>
-        <w:t>Networking</w:t>
-      </w:r>
-      <w:r>
-        <w:rPr>
-          <w:b/>
-        </w:rPr>
-        <w:t xml:space="preserve">: </w:t>
-      </w:r>
-      <w:r>
-        <w:t>LAN setup and structured/fibre-optic cabling, Wireless access point and SSID setup, Router and switch configuration, IP addressing and basic subnetting, Basic firewall and endpoint security</w:t>
+      </w:pPr>
+      <w:r>
+        <w:rPr>
+          <w:b/>
+          <w:bCs/>
+        </w:rPr>
+        <w:t xml:space="preserve">Networking: </w:t>
+      </w:r>
+      <w:r>
+        <w:t>LAN setup and structured/</w:t>
+      </w:r>
+      <w:proofErr w:type="spellStart"/>
+      <w:r>
+        <w:t>fibre</w:t>
+      </w:r>
+      <w:proofErr w:type="spellEnd"/>
+      <w:r>
+        <w:t xml:space="preserve">-optic cabling, wireless access point and SSID setup, router and switch configuration, IP addressing and basic </w:t>
+      </w:r>
+      <w:proofErr w:type="spellStart"/>
+      <w:r>
+        <w:t>subnetting</w:t>
+      </w:r>
+      <w:proofErr w:type="spellEnd"/>
+      <w:r>
+        <w:t>, basic firewall and endpoint security</w:t>
       </w:r>
     </w:p>
     <w:p>
@@ -367,7 +626,54 @@
           <w:sz w:val="24"/>
           <w:szCs w:val="24"/>
         </w:rPr>
-        <w:t>COURSES &amp; CERTIFICATIONS</w:t>
+        <w:lastRenderedPageBreak/>
+        <w:t>WORK EXPERIENCE</w:t>
+      </w:r>
+    </w:p>
+    <w:p>
+      <w:pPr>
+        <w:tabs>
+          <w:tab w:val="right" w:pos="10080"/>
+        </w:tabs>
+        <w:spacing w:before="140"/>
+      </w:pPr>
+      <w:r>
+        <w:rPr>
+          <w:b/>
+          <w:bCs/>
+        </w:rPr>
+        <w:t>IT Intern</w:t>
+      </w:r>
+      <w:r>
+        <w:rPr>
+          <w:color w:val="444444"/>
+        </w:rPr>
+        <w:t xml:space="preserve">   |   Luisa </w:t>
+      </w:r>
+      <w:proofErr w:type="spellStart"/>
+      <w:r>
+        <w:rPr>
+          <w:color w:val="444444"/>
+        </w:rPr>
+        <w:t>Guidotti</w:t>
+      </w:r>
+      <w:proofErr w:type="spellEnd"/>
+      <w:r>
+        <w:rPr>
+          <w:color w:val="444444"/>
+        </w:rPr>
+        <w:t xml:space="preserve"> Hospital</w:t>
+      </w:r>
+      <w:r>
+        <w:rPr>
+          <w:i/>
+          <w:iCs/>
+          <w:color w:val="444444"/>
+          <w:sz w:val="20"/>
+          <w:szCs w:val="20"/>
+        </w:rPr>
+        <w:tab/>
+        <w:t>Aug 2024 – Jun 2025</w:t>
       </w:r>
     </w:p>
     <w:p>
@@ -380,7 +686,7 @@
         <w:spacing w:after="40" w:line="252" w:lineRule="auto"/>
       </w:pPr>
       <w:r>
-        <w:t>Machine Learning with Python – freeCodeCamp</w:t>
+        <w:t>Acted as first point of contact for IT issues, resolving an average of 3–5 hardware and software support tickets per week and helping maintain approximately 95% system availability across hospital IT infrastructure.</w:t>
       </w:r>
     </w:p>
     <w:p>
@@ -393,7 +699,7 @@
         <w:spacing w:after="40" w:line="252" w:lineRule="auto"/>
       </w:pPr>
       <w:r>
-        <w:t>Scientific Computing with Python – freeCodeCamp</w:t>
+        <w:t>Performed routine system maintenance, including firmware and security patching on network devices, hardware servicing and configuration updates.</w:t>
       </w:r>
     </w:p>
     <w:p>
@@ -406,7 +712,23 @@
         <w:spacing w:after="40" w:line="252" w:lineRule="auto"/>
       </w:pPr>
       <w:r>
-        <w:t>Legacy Responsive Web Design – freeCodeCamp</w:t>
+        <w:t xml:space="preserve">Supported the planning and installation of new </w:t>
+      </w:r>
+      <w:proofErr w:type="spellStart"/>
+      <w:r>
+        <w:t>Starlink</w:t>
+      </w:r>
+      <w:proofErr w:type="spellEnd"/>
+      <w:r>
+        <w:t xml:space="preserve"> network infrastructure using </w:t>
+      </w:r>
+      <w:proofErr w:type="spellStart"/>
+      <w:r>
+        <w:t>fibre</w:t>
+      </w:r>
+      <w:proofErr w:type="spellEnd"/>
+      <w:r>
+        <w:t xml:space="preserve"> optic cabling, extending reliable connectivity to previously underserved hospital areas.</w:t>
       </w:r>
     </w:p>
     <w:p>
@@ -419,62 +741,7 @@
         <w:spacing w:after="40" w:line="252" w:lineRule="auto"/>
       </w:pPr>
       <w:r>
-        <w:t>CyberEd Pro+ Cybersecurity Certification (in progress)</w:t>
-      </w:r>
-    </w:p>
-    <w:p>
-      <w:pPr>
-        <w:pBdr>
-          <w:bottom w:val="single" w:sz="6" w:space="2" w:color="1F3A5F"/>
-        </w:pBdr>
-        <w:spacing w:before="240" w:after="100"/>
-      </w:pPr>
-      <w:r>
-        <w:rPr>
-          <w:b/>
-          <w:bCs/>
-          <w:color w:val="1F3A5F"/>
-          <w:spacing w:val="20"/>
-          <w:sz w:val="24"/>
-          <w:szCs w:val="24"/>
-        </w:rPr>
-        <w:t>WORK EXPERIENCE</w:t>
-      </w:r>
-    </w:p>
-    <w:p>
-      <w:pPr>
-        <w:tabs>
-          <w:tab w:val="right" w:pos="10080"/>
-        </w:tabs>
-        <w:spacing w:before="140"/>
-      </w:pPr>
-      <w:r>
-        <w:rPr>
-          <w:b/>
-          <w:bCs/>
-          <w:sz w:val="22"/>
-          <w:szCs w:val="22"/>
-        </w:rPr>
-        <w:t>IT Intern</w:t>
-      </w:r>
-      <w:r>
-        <w:rPr>
-          <w:color w:val="444444"/>
-          <w:sz w:val="22"/>
-          <w:szCs w:val="22"/>
-        </w:rPr>
-        <w:t xml:space="preserve">   |   Luisa Guidotti Hospital</w:t>
-      </w:r>
-      <w:r>
-        <w:rPr>
-          <w:i/>
-          <w:iCs/>
-          <w:color w:val="444444"/>
-          <w:sz w:val="20"/>
-          <w:szCs w:val="20"/>
-        </w:rPr>
-        <w:tab/>
-        <w:t>Aug 2024 – Jun 2025</w:t>
+        <w:t>Administered sensitive patient health records in the DHIS2 system, maintaining data integrity and removing duplicate entries.</w:t>
       </w:r>
     </w:p>
     <w:p>
@@ -487,7 +754,7 @@
         <w:spacing w:after="40" w:line="252" w:lineRule="auto"/>
       </w:pPr>
       <w:r>
-        <w:t>Provided first-line hardware and software support to staff, resolving issues to maintain system availability and minimise operational downtime.</w:t>
+        <w:t>Trained and provided ongoing technical support to a department team of under 10 staff on new systems and basic troubleshooting, reducing repeat support requests.</w:t>
       </w:r>
     </w:p>
     <w:p>
@@ -500,7 +767,47 @@
         <w:spacing w:after="40" w:line="252" w:lineRule="auto"/>
       </w:pPr>
       <w:r>
-        <w:t>Performed routine system maintenance, including firmware and security patching on network devices, hardware servicing and configuration updates.</w:t>
+        <w:t xml:space="preserve">Maintained accurate records of ICT hardware, software </w:t>
+      </w:r>
+      <w:proofErr w:type="spellStart"/>
+      <w:r>
+        <w:t>licences</w:t>
+      </w:r>
+      <w:proofErr w:type="spellEnd"/>
+      <w:r>
+        <w:t xml:space="preserve"> and peripheral devices, and developed internal software tools and automated user-guide documentation in PHP to improve staff workflows.</w:t>
+      </w:r>
+    </w:p>
+    <w:p>
+      <w:pPr>
+        <w:tabs>
+          <w:tab w:val="right" w:pos="10080"/>
+        </w:tabs>
+        <w:spacing w:before="140"/>
+      </w:pPr>
+      <w:r>
+        <w:rPr>
+          <w:b/>
+          <w:bCs/>
+        </w:rPr>
+        <w:t>Loans Agent</w:t>
+      </w:r>
+      <w:r>
+        <w:rPr>
+          <w:color w:val="444444"/>
+        </w:rPr>
+        <w:t xml:space="preserve">   |   Red Sphere (CBZ)</w:t>
+      </w:r>
+      <w:r>
+        <w:rPr>
+          <w:i/>
+          <w:iCs/>
+          <w:color w:val="444444"/>
+          <w:sz w:val="20"/>
+          <w:szCs w:val="20"/>
+        </w:rPr>
+        <w:tab/>
+        <w:t>Jun 2023 – Sep 2023</w:t>
       </w:r>
     </w:p>
     <w:p>
@@ -513,7 +820,7 @@
         <w:spacing w:after="40" w:line="252" w:lineRule="auto"/>
       </w:pPr>
       <w:r>
-        <w:t>Supported the planning and installation of new Starlink network infrastructure using fibre optic cabling.</w:t>
+        <w:t>Processed and issued loans to civil servants, guiding applicants through eligibility, documentation and the full application process.</w:t>
       </w:r>
     </w:p>
     <w:p>
@@ -526,8 +833,7 @@
         <w:spacing w:after="40" w:line="252" w:lineRule="auto"/>
       </w:pPr>
       <w:r>
-        <w:lastRenderedPageBreak/>
-        <w:t>Administered sensitive patient health records in the DHIS2 system, maintaining data integrity and removing duplicate entries.</w:t>
+        <w:t>Conducted KYC and affordability checks, assessing applications against lending criteria before approval and disbursement.</w:t>
       </w:r>
     </w:p>
     <w:p>
@@ -540,7 +846,7 @@
         <w:spacing w:after="40" w:line="252" w:lineRule="auto"/>
       </w:pPr>
       <w:r>
-        <w:t>Maintained accurate records of ICT hardware, software licences and peripheral devices.</w:t>
+        <w:t>Captured and verified client information, maintained accurate records and safeguarded sensitive personal and financial data in line with lending requirements.</w:t>
       </w:r>
     </w:p>
     <w:p>
@@ -553,7 +859,26 @@
         <w:spacing w:after="40" w:line="252" w:lineRule="auto"/>
       </w:pPr>
       <w:r>
-        <w:t>Developed internal software tools and automated user-guide documentation in PHP, improving staff workflows.</w:t>
+        <w:t>Provided front-line customer service, resolving client queries and explaining loan terms clearly.</w:t>
+      </w:r>
+    </w:p>
+    <w:p>
+      <w:pPr>
+        <w:pBdr>
+          <w:bottom w:val="single" w:sz="6" w:space="2" w:color="1F3A5F"/>
+        </w:pBdr>
+        <w:spacing w:before="240" w:after="100"/>
+      </w:pPr>
+      <w:r>
+        <w:rPr>
+          <w:b/>
+          <w:bCs/>
+          <w:color w:val="1F3A5F"/>
+          <w:spacing w:val="20"/>
+          <w:sz w:val="24"/>
+          <w:szCs w:val="24"/>
+        </w:rPr>
+        <w:t>EDUCATION</w:t>
       </w:r>
     </w:p>
     <w:p>
@@ -561,24 +886,61 @@
         <w:tabs>
           <w:tab w:val="right" w:pos="10080"/>
         </w:tabs>
-        <w:spacing w:before="140"/>
-      </w:pPr>
-      <w:r>
-        <w:rPr>
-          <w:b/>
-          <w:bCs/>
-          <w:sz w:val="22"/>
-          <w:szCs w:val="22"/>
-        </w:rPr>
-        <w:t>Loans Agent</w:t>
-      </w:r>
-      <w:r>
-        <w:rPr>
-          <w:color w:val="444444"/>
-          <w:sz w:val="22"/>
-          <w:szCs w:val="22"/>
-        </w:rPr>
-        <w:t xml:space="preserve">   |   Red Sphere (CBZ)</w:t>
+      </w:pPr>
+      <w:r>
+        <w:rPr>
+          <w:b/>
+          <w:bCs/>
+        </w:rPr>
+        <w:t>BSc (</w:t>
+      </w:r>
+      <w:proofErr w:type="spellStart"/>
+      <w:r>
+        <w:rPr>
+          <w:b/>
+          <w:bCs/>
+        </w:rPr>
+        <w:t>Honours</w:t>
+      </w:r>
+      <w:proofErr w:type="spellEnd"/>
+      <w:r>
+        <w:rPr>
+          <w:b/>
+          <w:bCs/>
+        </w:rPr>
+        <w:t xml:space="preserve">) Information </w:t>
+      </w:r>
+      <w:proofErr w:type="gramStart"/>
+      <w:r>
+        <w:rPr>
+          <w:b/>
+          <w:bCs/>
+        </w:rPr>
+        <w:t>Technology  |</w:t>
+      </w:r>
+      <w:proofErr w:type="gramEnd"/>
+      <w:r>
+        <w:rPr>
+          <w:b/>
+          <w:bCs/>
+        </w:rPr>
+        <w:t xml:space="preserve">  </w:t>
+      </w:r>
+      <w:proofErr w:type="spellStart"/>
+      <w:r>
+        <w:rPr>
+          <w:b/>
+          <w:bCs/>
+        </w:rPr>
+        <w:t>Chinhoyi</w:t>
+      </w:r>
+      <w:proofErr w:type="spellEnd"/>
+      <w:r>
+        <w:rPr>
+          <w:b/>
+          <w:bCs/>
+        </w:rPr>
+        <w:t xml:space="preserve"> University of Technology</w:t>
       </w:r>
       <w:r>
         <w:rPr>
@@ -589,7 +951,70 @@
           <w:szCs w:val="20"/>
         </w:rPr>
         <w:tab/>
-        <w:t>Jun 2023 – Sep 2023</w:t>
+        <w:t>2022 – 2026</w:t>
+      </w:r>
+    </w:p>
+    <w:p>
+      <w:pPr>
+        <w:tabs>
+          <w:tab w:val="right" w:pos="10080"/>
+        </w:tabs>
+        <w:spacing w:after="50" w:line="252" w:lineRule="auto"/>
+      </w:pPr>
+      <w:r>
+        <w:t>Advanced Level – 3 passes</w:t>
+      </w:r>
+      <w:r>
+        <w:rPr>
+          <w:i/>
+          <w:iCs/>
+          <w:color w:val="444444"/>
+          <w:sz w:val="20"/>
+          <w:szCs w:val="20"/>
+        </w:rPr>
+        <w:tab/>
+        <w:t>2020 – 2021</w:t>
+      </w:r>
+    </w:p>
+    <w:p>
+      <w:pPr>
+        <w:tabs>
+          <w:tab w:val="right" w:pos="10080"/>
+        </w:tabs>
+        <w:spacing w:after="50" w:line="252" w:lineRule="auto"/>
+      </w:pPr>
+      <w:r>
+        <w:t>Ordinary Level – 11 passes (incl. English &amp; Mathematics)</w:t>
+      </w:r>
+      <w:r>
+        <w:rPr>
+          <w:i/>
+          <w:iCs/>
+          <w:color w:val="444444"/>
+          <w:sz w:val="20"/>
+          <w:szCs w:val="20"/>
+        </w:rPr>
+        <w:tab/>
+        <w:t>2016 – 2019</w:t>
+      </w:r>
+    </w:p>
+    <w:p>
+      <w:pPr>
+        <w:pBdr>
+          <w:bottom w:val="single" w:sz="6" w:space="2" w:color="1F3A5F"/>
+        </w:pBdr>
+        <w:spacing w:before="240" w:after="100"/>
+      </w:pPr>
+      <w:r>
+        <w:rPr>
+          <w:b/>
+          <w:bCs/>
+          <w:color w:val="1F3A5F"/>
+          <w:spacing w:val="20"/>
+          <w:sz w:val="24"/>
+          <w:szCs w:val="24"/>
+        </w:rPr>
+        <w:t>COURSES &amp; CERTIFICATIONS</w:t>
       </w:r>
     </w:p>
     <w:p>
@@ -602,8 +1027,28 @@
         <w:spacing w:after="40" w:line="252" w:lineRule="auto"/>
       </w:pPr>
       <w:r>
-        <w:t>Processed and issued loans to civil servants, guiding applicants through eligibility, documentation and the full application process.</w:t>
-      </w:r>
+        <w:t xml:space="preserve">Machine Learning with Python – </w:t>
+      </w:r>
+      <w:proofErr w:type="spellStart"/>
+      <w:r>
+        <w:t>freeCodeCamp</w:t>
+      </w:r>
+      <w:proofErr w:type="spellEnd"/>
+      <w:r>
+        <w:t xml:space="preserve"> (Sep 2025)  </w:t>
+      </w:r>
+      <w:hyperlink r:id="rId10" w:history="1">
+        <w:r>
+          <w:rPr>
+            <w:i/>
+            <w:iCs/>
+            <w:color w:val="1F3A5F"/>
+            <w:sz w:val="19"/>
+            <w:szCs w:val="19"/>
+          </w:rPr>
+          <w:t>(verify)</w:t>
+        </w:r>
+      </w:hyperlink>
     </w:p>
     <w:p>
       <w:pPr>
@@ -615,8 +1060,28 @@
         <w:spacing w:after="40" w:line="252" w:lineRule="auto"/>
       </w:pPr>
       <w:r>
-        <w:t>Conducted KYC and affordability checks, assessing applications against lending criteria before approval and disbursement.</w:t>
-      </w:r>
+        <w:t xml:space="preserve">Scientific Computing with Python – </w:t>
+      </w:r>
+      <w:proofErr w:type="spellStart"/>
+      <w:r>
+        <w:t>freeCodeCamp</w:t>
+      </w:r>
+      <w:proofErr w:type="spellEnd"/>
+      <w:r>
+        <w:t xml:space="preserve"> (Sep 2025)  </w:t>
+      </w:r>
+      <w:hyperlink r:id="rId11" w:history="1">
+        <w:r>
+          <w:rPr>
+            <w:i/>
+            <w:iCs/>
+            <w:color w:val="1F3A5F"/>
+            <w:sz w:val="19"/>
+            <w:szCs w:val="19"/>
+          </w:rPr>
+          <w:t>(verify)</w:t>
+        </w:r>
+      </w:hyperlink>
     </w:p>
     <w:p>
       <w:pPr>
@@ -628,8 +1093,28 @@
         <w:spacing w:after="40" w:line="252" w:lineRule="auto"/>
       </w:pPr>
       <w:r>
-        <w:t>Captured and verified client information, maintained accurate records and safeguarded sensitive personal and financial data in line with lending requirements.</w:t>
-      </w:r>
+        <w:t xml:space="preserve">Legacy Responsive Web Design (V8) – </w:t>
+      </w:r>
+      <w:proofErr w:type="spellStart"/>
+      <w:r>
+        <w:t>freeCodeCamp</w:t>
+      </w:r>
+      <w:proofErr w:type="spellEnd"/>
+      <w:r>
+        <w:t xml:space="preserve"> (Mar 2025)  </w:t>
+      </w:r>
+      <w:hyperlink r:id="rId12" w:history="1">
+        <w:r>
+          <w:rPr>
+            <w:i/>
+            <w:iCs/>
+            <w:color w:val="1F3A5F"/>
+            <w:sz w:val="19"/>
+            <w:szCs w:val="19"/>
+          </w:rPr>
+          <w:t>(verify)</w:t>
+        </w:r>
+      </w:hyperlink>
     </w:p>
     <w:p>
       <w:pPr>
@@ -640,443 +1125,13 @@
         </w:numPr>
         <w:spacing w:after="40" w:line="252" w:lineRule="auto"/>
       </w:pPr>
-      <w:r>
-        <w:t>Provided front-line customer service, resolving client queries and explaining loan terms clearly.</w:t>
-      </w:r>
-    </w:p>
-    <w:p>
-      <w:pPr>
-        <w:pBdr>
-          <w:bottom w:val="single" w:sz="6" w:space="2" w:color="1F3A5F"/>
-        </w:pBdr>
-        <w:spacing w:before="240" w:after="100"/>
-      </w:pPr>
-      <w:r>
-        <w:rPr>
-          <w:b/>
-          <w:bCs/>
-          <w:color w:val="1F3A5F"/>
-          <w:spacing w:val="20"/>
-          <w:sz w:val="24"/>
-          <w:szCs w:val="24"/>
-        </w:rPr>
-        <w:t>KEY TECHNICAL PROJECTS</w:t>
-      </w:r>
-    </w:p>
-    <w:p>
-      <w:pPr>
-        <w:spacing w:before="140" w:after="30"/>
-      </w:pPr>
-      <w:r>
-        <w:rPr>
-          <w:b/>
-          <w:bCs/>
-          <w:sz w:val="22"/>
-          <w:szCs w:val="22"/>
-        </w:rPr>
-        <w:t>ReelScholar</w:t>
-      </w:r>
-      <w:r>
-        <w:rPr>
-          <w:i/>
-          <w:iCs/>
-          <w:color w:val="444444"/>
-          <w:sz w:val="20"/>
-          <w:szCs w:val="20"/>
-        </w:rPr>
-        <w:t xml:space="preserve">   |   Flutter, Laravel, Python/TensorFlow, SQLite/MySQL</w:t>
-      </w:r>
-    </w:p>
-    <w:p>
-      <w:pPr>
-        <w:spacing w:after="40" w:line="252" w:lineRule="auto"/>
-      </w:pPr>
-      <w:r>
-        <w:t>Full-stack AI micro-learning mobile platform built as a capstone project for university students. Features user authentication, real-time messaging, AI-powered content moderation, gamification and a recommendation engine. Laravel REST API hosted on Laravel Cloud, with the Python</w:t>
-      </w:r>
-      <w:r>
-        <w:t xml:space="preserve"> MobileNetV2</w:t>
-      </w:r>
-      <w:bookmarkStart w:id="0" w:name="_GoBack"/>
-      <w:bookmarkEnd w:id="0"/>
-      <w:r>
-        <w:t xml:space="preserve"> moderation model deployed on Railway.</w:t>
-      </w:r>
-    </w:p>
-    <w:p>
-      <w:pPr>
-        <w:spacing w:before="140" w:after="30"/>
-      </w:pPr>
-      <w:r>
-        <w:rPr>
-          <w:b/>
-          <w:bCs/>
-          <w:sz w:val="22"/>
-          <w:szCs w:val="22"/>
-        </w:rPr>
-        <w:t>Divine</w:t>
-      </w:r>
-      <w:r>
-        <w:rPr>
-          <w:b/>
-          <w:bCs/>
-          <w:sz w:val="22"/>
-          <w:szCs w:val="22"/>
-        </w:rPr>
-        <w:t xml:space="preserve"> School Management System</w:t>
-      </w:r>
-      <w:r>
-        <w:rPr>
-          <w:i/>
-          <w:iCs/>
-          <w:color w:val="444444"/>
-          <w:sz w:val="20"/>
-          <w:szCs w:val="20"/>
-        </w:rPr>
-        <w:t xml:space="preserve"> </w:t>
-      </w:r>
-      <w:r>
-        <w:rPr>
-          <w:i/>
-          <w:iCs/>
-          <w:color w:val="444444"/>
-          <w:sz w:val="20"/>
-          <w:szCs w:val="20"/>
-        </w:rPr>
-        <w:t xml:space="preserve">  |   Electron, React, Node.js &amp; </w:t>
-      </w:r>
-      <w:r>
-        <w:rPr>
-          <w:i/>
-          <w:iCs/>
-          <w:color w:val="444444"/>
-          <w:sz w:val="20"/>
-          <w:szCs w:val="20"/>
-        </w:rPr>
-        <w:t>SQLite</w:t>
-      </w:r>
-    </w:p>
-    <w:p>
-      <w:pPr>
-        <w:spacing w:after="40" w:line="252" w:lineRule="auto"/>
-      </w:pPr>
-      <w:r>
-        <w:t xml:space="preserve">Offline-first desktop application delivered </w:t>
-      </w:r>
-      <w:r>
-        <w:t>for a primary school.</w:t>
-      </w:r>
-      <w:r>
-        <w:t xml:space="preserve"> Built with Electron, React and Node.js over a local SQLite (better-sqlite3) database with role-based modules (Administrator, Bursar, Teacher) for student registration, guardian records, fee payments with printable PDF receipts, attendance, academic reports and one-click backup and restore. Secured with bcrypt password hashing, role-based permissions, audit logging and Electron context isolation, packaged as a Windows installer and running fully offline for low-connectivity environments.</w:t>
-      </w:r>
-    </w:p>
-    <w:p>
-      <w:pPr>
-        <w:spacing w:before="140" w:after="30"/>
-      </w:pPr>
-      <w:r>
-        <w:rPr>
-          <w:b/>
-          <w:bCs/>
-          <w:sz w:val="22"/>
-          <w:szCs w:val="22"/>
-        </w:rPr>
-        <w:t>School Portal System</w:t>
-      </w:r>
-      <w:r>
-        <w:rPr>
-          <w:i/>
-          <w:iCs/>
-          <w:color w:val="444444"/>
-          <w:sz w:val="20"/>
-          <w:szCs w:val="20"/>
-        </w:rPr>
-        <w:t xml:space="preserve">   | </w:t>
-      </w:r>
-      <w:r>
-        <w:rPr>
-          <w:i/>
-          <w:iCs/>
-          <w:color w:val="444444"/>
-          <w:sz w:val="20"/>
-          <w:szCs w:val="20"/>
-        </w:rPr>
-        <w:t xml:space="preserve">  Flutter, FastAPI, &amp; </w:t>
-      </w:r>
-      <w:r>
-        <w:rPr>
-          <w:i/>
-          <w:iCs/>
-          <w:color w:val="444444"/>
-          <w:sz w:val="20"/>
-          <w:szCs w:val="20"/>
-        </w:rPr>
-        <w:t>MongoDB</w:t>
-      </w:r>
-    </w:p>
-    <w:p>
-      <w:pPr>
-        <w:spacing w:after="40" w:line="252" w:lineRule="auto"/>
-      </w:pPr>
-      <w:r>
-        <w:t>Role-based school management web application with three distinct user roles (Administrator, Staff, Student), enforcing data segregation and appropriate access control. Manages student records, academic results and operational reporting.</w:t>
-      </w:r>
-    </w:p>
-    <w:p>
-      <w:pPr>
-        <w:pBdr>
-          <w:bottom w:val="single" w:sz="6" w:space="2" w:color="1F3A5F"/>
-        </w:pBdr>
-        <w:spacing w:before="240" w:after="100"/>
-      </w:pPr>
-      <w:r>
-        <w:rPr>
-          <w:b/>
-          <w:bCs/>
-          <w:color w:val="1F3A5F"/>
-          <w:spacing w:val="20"/>
-          <w:sz w:val="24"/>
-          <w:szCs w:val="24"/>
-        </w:rPr>
-        <w:t>REFERENCES</w:t>
-      </w:r>
-    </w:p>
-    <w:p>
-      <w:pPr>
-        <w:spacing w:after="40" w:line="252" w:lineRule="auto"/>
-      </w:pPr>
-      <w:r>
-        <w:rPr>
-          <w:b/>
-          <w:bCs/>
-        </w:rPr>
-        <w:t>Mr Matanga</w:t>
-      </w:r>
-      <w:r>
-        <w:t xml:space="preserve">  –  IT Supervisor, Luisa Guidotti Hospital  |  +263 78 002 9895</w:t>
-      </w:r>
-    </w:p>
-    <w:p>
-      <w:pPr>
-        <w:spacing w:after="40" w:line="252" w:lineRule="auto"/>
-      </w:pPr>
-      <w:r>
-        <w:rPr>
-          <w:b/>
-          <w:bCs/>
-        </w:rPr>
-        <w:t>Mrs Muzhindi</w:t>
-      </w:r>
-      <w:r>
-        <w:t xml:space="preserve">  –  Manager, Red Sphere (CBZ)  |  +263 77 416 8054</w:t>
-      </w:r>
-    </w:p>
-    <w:p>
-      <w:pPr>
-        <w:spacing w:after="40" w:line="252" w:lineRule="auto"/>
-      </w:pPr>
-    </w:p>
-    <w:p>
-      <w:pPr>
-        <w:spacing w:after="40" w:line="252" w:lineRule="auto"/>
-      </w:pPr>
-    </w:p>
-    <w:p>
-      <w:pPr>
-        <w:spacing w:after="40" w:line="252" w:lineRule="auto"/>
-      </w:pPr>
-    </w:p>
-    <w:p>
-      <w:pPr>
-        <w:spacing w:after="40" w:line="252" w:lineRule="auto"/>
-      </w:pPr>
-    </w:p>
-    <w:p>
-      <w:pPr>
-        <w:spacing w:after="40" w:line="252" w:lineRule="auto"/>
-      </w:pPr>
-    </w:p>
-    <w:p>
-      <w:pPr>
-        <w:spacing w:after="40" w:line="252" w:lineRule="auto"/>
-      </w:pPr>
-    </w:p>
-    <w:p>
-      <w:pPr>
-        <w:spacing w:after="40" w:line="252" w:lineRule="auto"/>
-      </w:pPr>
-    </w:p>
-    <w:p>
-      <w:pPr>
-        <w:spacing w:after="40" w:line="252" w:lineRule="auto"/>
-      </w:pPr>
-    </w:p>
-    <w:p>
-      <w:pPr>
-        <w:spacing w:after="40" w:line="252" w:lineRule="auto"/>
-      </w:pPr>
-    </w:p>
-    <w:p>
-      <w:pPr>
-        <w:spacing w:after="40" w:line="252" w:lineRule="auto"/>
-      </w:pPr>
-    </w:p>
-    <w:p>
-      <w:pPr>
-        <w:spacing w:after="40" w:line="252" w:lineRule="auto"/>
-      </w:pPr>
-      <w:r>
-        <w:rPr>
-          <w:noProof/>
-        </w:rPr>
-        <w:lastRenderedPageBreak/>
-        <w:drawing>
-          <wp:inline distT="0" distB="0" distL="0" distR="0" wp14:anchorId="17560341" wp14:editId="59C79EA4">
-            <wp:extent cx="4733925" cy="3067050"/>
-            <wp:effectExtent l="0" t="0" r="9525" b="0"/>
-            <wp:docPr id="10" name="Picture 10"/>
-            <wp:cNvGraphicFramePr>
-              <a:graphicFrameLocks xmlns:a="http://schemas.openxmlformats.org/drawingml/2006/main" noChangeAspect="1"/>
-            </wp:cNvGraphicFramePr>
-            <a:graphic xmlns:a="http://schemas.openxmlformats.org/drawingml/2006/main">
-              <a:graphicData uri="http://schemas.openxmlformats.org/drawingml/2006/picture">
-                <pic:pic xmlns:pic="http://schemas.openxmlformats.org/drawingml/2006/picture">
-                  <pic:nvPicPr>
-                    <pic:cNvPr id="1" name=""/>
-                    <pic:cNvPicPr/>
-                  </pic:nvPicPr>
-                  <pic:blipFill rotWithShape="1">
-                    <a:blip r:embed="rId8"/>
-                    <a:srcRect l="11111" t="7954" r="12191" b="3713"/>
-                    <a:stretch/>
-                  </pic:blipFill>
-                  <pic:spPr bwMode="auto">
-                    <a:xfrm>
-                      <a:off x="0" y="0"/>
-                      <a:ext cx="4733925" cy="3067050"/>
-                    </a:xfrm>
-                    <a:prstGeom prst="rect">
-                      <a:avLst/>
-                    </a:prstGeom>
-                    <a:ln>
-                      <a:noFill/>
-                    </a:ln>
-                    <a:extLst>
-                      <a:ext uri="{53640926-AAD7-44D8-BBD7-CCE9431645EC}">
-                        <a14:shadowObscured xmlns:a14="http://schemas.microsoft.com/office/drawing/2010/main"/>
-                      </a:ext>
-                    </a:extLst>
-                  </pic:spPr>
-                </pic:pic>
-              </a:graphicData>
-            </a:graphic>
-          </wp:inline>
-        </w:drawing>
-      </w:r>
-    </w:p>
-    <w:p>
-      <w:pPr>
-        <w:spacing w:after="40" w:line="252" w:lineRule="auto"/>
-      </w:pPr>
-      <w:r>
-        <w:rPr>
-          <w:noProof/>
-        </w:rPr>
-        <w:drawing>
-          <wp:inline distT="0" distB="0" distL="0" distR="0" wp14:anchorId="7811520E" wp14:editId="4B85C863">
-            <wp:extent cx="4724400" cy="2905125"/>
-            <wp:effectExtent l="0" t="0" r="0" b="9525"/>
-            <wp:docPr id="11" name="Picture 11"/>
-            <wp:cNvGraphicFramePr>
-              <a:graphicFrameLocks xmlns:a="http://schemas.openxmlformats.org/drawingml/2006/main" noChangeAspect="1"/>
-            </wp:cNvGraphicFramePr>
-            <a:graphic xmlns:a="http://schemas.openxmlformats.org/drawingml/2006/main">
-              <a:graphicData uri="http://schemas.openxmlformats.org/drawingml/2006/picture">
-                <pic:pic xmlns:pic="http://schemas.openxmlformats.org/drawingml/2006/picture">
-                  <pic:nvPicPr>
-                    <pic:cNvPr id="1" name=""/>
-                    <pic:cNvPicPr/>
-                  </pic:nvPicPr>
-                  <pic:blipFill rotWithShape="1">
-                    <a:blip r:embed="rId9"/>
-                    <a:srcRect l="14661" t="8779" r="16050" b="7553"/>
-                    <a:stretch/>
-                  </pic:blipFill>
-                  <pic:spPr bwMode="auto">
-                    <a:xfrm>
-                      <a:off x="0" y="0"/>
-                      <a:ext cx="4724400" cy="2905125"/>
-                    </a:xfrm>
-                    <a:prstGeom prst="rect">
-                      <a:avLst/>
-                    </a:prstGeom>
-                    <a:ln>
-                      <a:noFill/>
-                    </a:ln>
-                    <a:extLst>
-                      <a:ext uri="{53640926-AAD7-44D8-BBD7-CCE9431645EC}">
-                        <a14:shadowObscured xmlns:a14="http://schemas.microsoft.com/office/drawing/2010/main"/>
-                      </a:ext>
-                    </a:extLst>
-                  </pic:spPr>
-                </pic:pic>
-              </a:graphicData>
-            </a:graphic>
-          </wp:inline>
-        </w:drawing>
-      </w:r>
-    </w:p>
-    <w:p>
-      <w:pPr>
-        <w:spacing w:after="40" w:line="252" w:lineRule="auto"/>
-      </w:pPr>
-      <w:r>
-        <w:rPr>
-          <w:noProof/>
-        </w:rPr>
-        <w:lastRenderedPageBreak/>
-        <w:drawing>
-          <wp:inline distT="0" distB="0" distL="0" distR="0" wp14:anchorId="79A5BE25" wp14:editId="667C9876">
-            <wp:extent cx="4762500" cy="2971800"/>
-            <wp:effectExtent l="0" t="0" r="0" b="0"/>
-            <wp:docPr id="12" name="Picture 12"/>
-            <wp:cNvGraphicFramePr>
-              <a:graphicFrameLocks xmlns:a="http://schemas.openxmlformats.org/drawingml/2006/main" noChangeAspect="1"/>
-            </wp:cNvGraphicFramePr>
-            <a:graphic xmlns:a="http://schemas.openxmlformats.org/drawingml/2006/main">
-              <a:graphicData uri="http://schemas.openxmlformats.org/drawingml/2006/picture">
-                <pic:pic xmlns:pic="http://schemas.openxmlformats.org/drawingml/2006/picture">
-                  <pic:nvPicPr>
-                    <pic:cNvPr id="1" name=""/>
-                    <pic:cNvPicPr/>
-                  </pic:nvPicPr>
-                  <pic:blipFill rotWithShape="1">
-                    <a:blip r:embed="rId10"/>
-                    <a:srcRect l="14198" t="8230" r="15894" b="6181"/>
-                    <a:stretch/>
-                  </pic:blipFill>
-                  <pic:spPr bwMode="auto">
-                    <a:xfrm>
-                      <a:off x="0" y="0"/>
-                      <a:ext cx="4762500" cy="2971800"/>
-                    </a:xfrm>
-                    <a:prstGeom prst="rect">
-                      <a:avLst/>
-                    </a:prstGeom>
-                    <a:ln>
-                      <a:noFill/>
-                    </a:ln>
-                    <a:extLst>
-                      <a:ext uri="{53640926-AAD7-44D8-BBD7-CCE9431645EC}">
-                        <a14:shadowObscured xmlns:a14="http://schemas.microsoft.com/office/drawing/2010/main"/>
-                      </a:ext>
-                    </a:extLst>
-                  </pic:spPr>
-                </pic:pic>
-              </a:graphicData>
-            </a:graphic>
-          </wp:inline>
-        </w:drawing>
+      <w:proofErr w:type="spellStart"/>
+      <w:r>
+        <w:t>CyberEd</w:t>
+      </w:r>
+      <w:proofErr w:type="spellEnd"/>
+      <w:r>
+        <w:t xml:space="preserve"> Pro+ Cybersecurity Certification (in progress)</w:t>
       </w:r>
     </w:p>
     <w:sectPr>
@@ -1092,10 +1147,10 @@
 <file path=word/numbering.xml><?xml version="1.0" encoding="utf-8"?>
 <w:numbering xmlns:wpc="http://schemas.microsoft.com/office/word/2010/wordprocessingCanvas" xmlns:cx="http://schemas.microsoft.com/office/drawing/2014/chartex" xmlns:cx1="http://schemas.microsoft.com/office/drawing/2015/9/8/chartex" xmlns:mc="http://schemas.openxmlformats.org/markup-compatibility/2006" xmlns:o="urn:schemas-microsoft-com:office:office" xmlns:r="http://schemas.openxmlformats.org/officeDocument/2006/relationships" xmlns:m="http://schemas.openxmlformats.org/officeDocument/2006/math" xmlns:v="urn:schemas-microsoft-com:vml" xmlns:wp14="http://schemas.microsoft.com/office/word/2010/wordprocessingDrawing" xmlns:wp="http://schemas.openxmlformats.org/drawingml/2006/wordprocessingDrawing" xmlns:w10="urn:schemas-microsoft-com:office:word" xmlns:w="http://schemas.openxmlformats.org/wordprocessingml/2006/main" xmlns:w14="http://schemas.microsoft.com/office/word/2010/wordml" xmlns:w15="http://schemas.microsoft.com/office/word/2012/wordml" xmlns:w16se="http://schemas.microsoft.com/office/word/2015/wordml/symex" xmlns:wpg="http://schemas.microsoft.com/office/word/2010/wordprocessingGroup" xmlns:wpi="http://schemas.microsoft.com/office/word/2010/wordprocessingInk" xmlns:wne="http://schemas.microsoft.com/office/word/2006/wordml" xmlns:wps="http://schemas.microsoft.com/office/word/2010/wordprocessingShape" mc:Ignorable="w14 w15 w16se wp14">
   <w:abstractNum w:abstractNumId="0" w15:restartNumberingAfterBreak="0">
-    <w:nsid w:val="4DEA4D26"/>
+    <w:nsid w:val="55FB3CE0"/>
     <w:multiLevelType w:val="hybridMultilevel"/>
-    <w:tmpl w:val="F530D01C"/>
-    <w:lvl w:ilvl="0" w:tplc="57CC987A">
+    <w:tmpl w:val="544AF8D8"/>
+    <w:lvl w:ilvl="0" w:tplc="1F78B7D2">
       <w:start w:val="1"/>
       <w:numFmt w:val="bullet"/>
       <w:lvlText w:val="●"/>
@@ -1104,7 +1159,7 @@
         <w:ind w:left="720" w:hanging="360"/>
       </w:pPr>
     </w:lvl>
-    <w:lvl w:ilvl="1" w:tplc="FCFCD74C">
+    <w:lvl w:ilvl="1" w:tplc="6DAA882A">
       <w:start w:val="1"/>
       <w:numFmt w:val="bullet"/>
       <w:lvlText w:val="○"/>
@@ -1113,7 +1168,7 @@
         <w:ind w:left="1440" w:hanging="360"/>
       </w:pPr>
     </w:lvl>
-    <w:lvl w:ilvl="2" w:tplc="2E68D816">
+    <w:lvl w:ilvl="2" w:tplc="29DAF9D8">
       <w:start w:val="1"/>
       <w:numFmt w:val="bullet"/>
       <w:lvlText w:val="■"/>
@@ -1122,7 +1177,7 @@
         <w:ind w:left="2160" w:hanging="360"/>
       </w:pPr>
     </w:lvl>
-    <w:lvl w:ilvl="3" w:tplc="6144D666">
+    <w:lvl w:ilvl="3" w:tplc="6874C8AA">
       <w:start w:val="1"/>
       <w:numFmt w:val="bullet"/>
       <w:lvlText w:val="●"/>
@@ -1131,7 +1186,7 @@
         <w:ind w:left="2880" w:hanging="360"/>
       </w:pPr>
     </w:lvl>
-    <w:lvl w:ilvl="4" w:tplc="B85E6146">
+    <w:lvl w:ilvl="4" w:tplc="D8723BB6">
       <w:start w:val="1"/>
       <w:numFmt w:val="bullet"/>
       <w:lvlText w:val="○"/>
@@ -1140,7 +1195,7 @@
         <w:ind w:left="3600" w:hanging="360"/>
       </w:pPr>
     </w:lvl>
-    <w:lvl w:ilvl="5" w:tplc="25BC068A">
+    <w:lvl w:ilvl="5" w:tplc="2E80608A">
       <w:start w:val="1"/>
       <w:numFmt w:val="bullet"/>
       <w:lvlText w:val="■"/>
@@ -1149,7 +1204,7 @@
         <w:ind w:left="4320" w:hanging="360"/>
       </w:pPr>
     </w:lvl>
-    <w:lvl w:ilvl="6" w:tplc="16C8716E">
+    <w:lvl w:ilvl="6" w:tplc="EBF6BDF4">
       <w:start w:val="1"/>
       <w:numFmt w:val="bullet"/>
       <w:lvlText w:val="●"/>
@@ -1158,7 +1213,7 @@
         <w:ind w:left="5040" w:hanging="360"/>
       </w:pPr>
     </w:lvl>
-    <w:lvl w:ilvl="7" w:tplc="052A5C18">
+    <w:lvl w:ilvl="7" w:tplc="F4586542">
       <w:start w:val="1"/>
       <w:numFmt w:val="bullet"/>
       <w:lvlText w:val="●"/>
@@ -1167,7 +1222,7 @@
         <w:ind w:left="5760" w:hanging="360"/>
       </w:pPr>
     </w:lvl>
-    <w:lvl w:ilvl="8" w:tplc="5BAEB12E">
+    <w:lvl w:ilvl="8" w:tplc="2A7055F4">
       <w:start w:val="1"/>
       <w:numFmt w:val="bullet"/>
       <w:lvlText w:val="●"/>
@@ -1178,54 +1233,54 @@
     </w:lvl>
   </w:abstractNum>
   <w:abstractNum w:abstractNumId="1" w15:restartNumberingAfterBreak="0">
-    <w:nsid w:val="60AD2742"/>
+    <w:nsid w:val="7F842E64"/>
     <w:multiLevelType w:val="hybridMultilevel"/>
-    <w:tmpl w:val="A12476E6"/>
-    <w:lvl w:ilvl="0" w:tplc="C2386E10">
+    <w:tmpl w:val="C11E499E"/>
+    <w:lvl w:ilvl="0" w:tplc="CB120BD8">
       <w:start w:val="1"/>
       <w:numFmt w:val="bullet"/>
       <w:lvlText w:val="•"/>
       <w:lvlJc w:val="left"/>
       <w:pPr>
-        <w:ind w:left="360" w:hanging="200"/>
+        <w:ind w:left="360" w:hanging="240"/>
       </w:pPr>
     </w:lvl>
-    <w:lvl w:ilvl="1" w:tplc="C1847340">
+    <w:lvl w:ilvl="1" w:tplc="A4E44048">
       <w:numFmt w:val="decimal"/>
       <w:lvlText w:val=""/>
       <w:lvlJc w:val="left"/>
     </w:lvl>
-    <w:lvl w:ilvl="2" w:tplc="F556ADA0">
+    <w:lvl w:ilvl="2" w:tplc="843C735E">
       <w:numFmt w:val="decimal"/>
       <w:lvlText w:val=""/>
       <w:lvlJc w:val="left"/>
     </w:lvl>
-    <w:lvl w:ilvl="3" w:tplc="893EA706">
+    <w:lvl w:ilvl="3" w:tplc="756E8C64">
       <w:numFmt w:val="decimal"/>
       <w:lvlText w:val=""/>
       <w:lvlJc w:val="left"/>
     </w:lvl>
-    <w:lvl w:ilvl="4" w:tplc="01C8AD60">
+    <w:lvl w:ilvl="4" w:tplc="5CB2710A">
       <w:numFmt w:val="decimal"/>
       <w:lvlText w:val=""/>
       <w:lvlJc w:val="left"/>
     </w:lvl>
-    <w:lvl w:ilvl="5" w:tplc="B3763D0C">
+    <w:lvl w:ilvl="5" w:tplc="EE84C57C">
       <w:numFmt w:val="decimal"/>
       <w:lvlText w:val=""/>
       <w:lvlJc w:val="left"/>
     </w:lvl>
-    <w:lvl w:ilvl="6" w:tplc="54F6D4D4">
+    <w:lvl w:ilvl="6" w:tplc="99C48E44">
       <w:numFmt w:val="decimal"/>
       <w:lvlText w:val=""/>
       <w:lvlJc w:val="left"/>
     </w:lvl>
-    <w:lvl w:ilvl="7" w:tplc="41E41C1E">
+    <w:lvl w:ilvl="7" w:tplc="6B34116C">
       <w:numFmt w:val="decimal"/>
       <w:lvlText w:val=""/>
       <w:lvlJc w:val="left"/>
     </w:lvl>
-    <w:lvl w:ilvl="8" w:tplc="18C20938">
+    <w:lvl w:ilvl="8" w:tplc="A28684C6">
       <w:numFmt w:val="decimal"/>
       <w:lvlText w:val=""/>
       <w:lvlJc w:val="left"/>
@@ -1252,8 +1307,8 @@
     <w:rPrDefault>
       <w:rPr>
         <w:rFonts w:ascii="Calibri" w:eastAsia="Calibri" w:hAnsi="Calibri" w:cs="Calibri"/>
-        <w:sz w:val="21"/>
-        <w:szCs w:val="21"/>
+        <w:sz w:val="22"/>
+        <w:szCs w:val="22"/>
         <w:lang w:val="en-US" w:eastAsia="en-US" w:bidi="ar-SA"/>
       </w:rPr>
     </w:rPrDefault>

</xml_diff>